<commit_message>
fix wgs project uploading behaviour and search function
</commit_message>
<xml_diff>
--- a/work_instructions/RITM_WEB_Database_Work_Instruction.docx
+++ b/work_instructions/RITM_WEB_Database_Work_Instruction.docx
@@ -1,6 +1,6 @@
 
 <file path=word/document.xml><?xml version="1.0" encoding="utf-8"?>
-<w:document xmlns:wpc="http://schemas.microsoft.com/office/word/2010/wordprocessingCanvas" xmlns:cx="http://schemas.microsoft.com/office/drawing/2014/chartex" xmlns:cx1="http://schemas.microsoft.com/office/drawing/2015/9/8/chartex" xmlns:cx2="http://schemas.microsoft.com/office/drawing/2015/10/21/chartex" xmlns:cx3="http://schemas.microsoft.com/office/drawing/2016/5/9/chartex" xmlns:cx4="http://schemas.microsoft.com/office/drawing/2016/5/10/chartex" xmlns:cx5="http://schemas.microsoft.com/office/drawing/2016/5/11/chartex" xmlns:cx6="http://schemas.microsoft.com/office/drawing/2016/5/12/chartex" xmlns:cx7="http://schemas.microsoft.com/office/drawing/2016/5/13/chartex" xmlns:cx8="http://schemas.microsoft.com/office/drawing/2016/5/14/chartex" xmlns:mc="http://schemas.openxmlformats.org/markup-compatibility/2006" xmlns:aink="http://schemas.microsoft.com/office/drawing/2016/ink" xmlns:am3d="http://schemas.microsoft.com/office/drawing/2017/model3d" xmlns:o="urn:schemas-microsoft-com:office:office" xmlns:oel="http://schemas.microsoft.com/office/2019/extlst" xmlns:r="http://schemas.openxmlformats.org/officeDocument/2006/relationships" xmlns:m="http://schemas.openxmlformats.org/officeDocument/2006/math" xmlns:v="urn:schemas-microsoft-com:vml" xmlns:wp14="http://schemas.microsoft.com/office/word/2010/wordprocessingDrawing" xmlns:wp="http://schemas.openxmlformats.org/drawingml/2006/wordprocessingDrawing" xmlns:w10="urn:schemas-microsoft-com:office:word" xmlns:w="http://schemas.openxmlformats.org/wordprocessingml/2006/main" xmlns:w14="http://schemas.microsoft.com/office/word/2010/wordml" xmlns:w15="http://schemas.microsoft.com/office/word/2012/wordml" xmlns:w16cex="http://schemas.microsoft.com/office/word/2018/wordml/cex" xmlns:w16cid="http://schemas.microsoft.com/office/word/2016/wordml/cid" xmlns:w16="http://schemas.microsoft.com/office/word/2018/wordml" xmlns:w16du="http://schemas.microsoft.com/office/word/2023/wordml/word16du" xmlns:w16sdtdh="http://schemas.microsoft.com/office/word/2020/wordml/sdtdatahash" xmlns:w16sdtfl="http://schemas.microsoft.com/office/word/2024/wordml/sdtformatlock" xmlns:w16se="http://schemas.microsoft.com/office/word/2015/wordml/symex" xmlns:wpg="http://schemas.microsoft.com/office/word/2010/wordprocessingGroup" xmlns:wpi="http://schemas.microsoft.com/office/word/2010/wordprocessingInk" xmlns:wne="http://schemas.microsoft.com/office/word/2006/wordml" xmlns:wps="http://schemas.microsoft.com/office/word/2010/wordprocessingShape" mc:Ignorable="w14 w15 w16se w16cid w16 w16cex w16sdtdh w16sdtfl w16du wp14">
+<w:document xmlns:wpc="http://schemas.microsoft.com/office/word/2010/wordprocessingCanvas" xmlns:cx="http://schemas.microsoft.com/office/drawing/2014/chartex" xmlns:cx1="http://schemas.microsoft.com/office/drawing/2015/9/8/chartex" xmlns:cx2="http://schemas.microsoft.com/office/drawing/2015/10/21/chartex" xmlns:cx3="http://schemas.microsoft.com/office/drawing/2016/5/9/chartex" xmlns:cx4="http://schemas.microsoft.com/office/drawing/2016/5/10/chartex" xmlns:cx5="http://schemas.microsoft.com/office/drawing/2016/5/11/chartex" xmlns:cx6="http://schemas.microsoft.com/office/drawing/2016/5/12/chartex" xmlns:cx7="http://schemas.microsoft.com/office/drawing/2016/5/13/chartex" xmlns:cx8="http://schemas.microsoft.com/office/drawing/2016/5/14/chartex" xmlns:mc="http://schemas.openxmlformats.org/markup-compatibility/2006" xmlns:aink="http://schemas.microsoft.com/office/drawing/2016/ink" xmlns:am3d="http://schemas.microsoft.com/office/drawing/2017/model3d" xmlns:o="urn:schemas-microsoft-com:office:office" xmlns:oel="http://schemas.microsoft.com/office/2019/extlst" xmlns:r="http://schemas.openxmlformats.org/officeDocument/2006/relationships" xmlns:m="http://schemas.openxmlformats.org/officeDocument/2006/math" xmlns:v="urn:schemas-microsoft-com:vml" xmlns:wp14="http://schemas.microsoft.com/office/word/2010/wordprocessingDrawing" xmlns:wp="http://schemas.openxmlformats.org/drawingml/2006/wordprocessingDrawing" xmlns:w10="urn:schemas-microsoft-com:office:word" xmlns:w="http://schemas.openxmlformats.org/wordprocessingml/2006/main" xmlns:w14="http://schemas.microsoft.com/office/word/2010/wordml" xmlns:w15="http://schemas.microsoft.com/office/word/2012/wordml" xmlns:w16cei="http://schemas.microsoft.com/office/word/2026/wordml/cei" xmlns:w16cex="http://schemas.microsoft.com/office/word/2018/wordml/cex" xmlns:w16cid="http://schemas.microsoft.com/office/word/2016/wordml/cid" xmlns:w16="http://schemas.microsoft.com/office/word/2018/wordml" xmlns:w16du="http://schemas.microsoft.com/office/word/2023/wordml/word16du" xmlns:w16sdtdh="http://schemas.microsoft.com/office/word/2020/wordml/sdtdatahash" xmlns:w16sdtfl="http://schemas.microsoft.com/office/word/2024/wordml/sdtformatlock" xmlns:w16se="http://schemas.microsoft.com/office/word/2015/wordml/symex" xmlns:wpg="http://schemas.microsoft.com/office/word/2010/wordprocessingGroup" xmlns:wpi="http://schemas.microsoft.com/office/word/2010/wordprocessingInk" xmlns:wne="http://schemas.microsoft.com/office/word/2006/wordml" xmlns:wps="http://schemas.microsoft.com/office/word/2010/wordprocessingShape" mc:Ignorable="w14 w15 w16se w16cid w16 w16cex w16sdtdh w16sdtfl w16du wp14">
   <w:body>
     <w:p>
       <w:pPr>
@@ -3524,16 +3524,568 @@
         <w:pStyle w:val="ListNumber"/>
       </w:pPr>
       <w:r>
+        <w:rPr>
+          <w:noProof/>
+        </w:rPr>
+        <mc:AlternateContent>
+          <mc:Choice Requires="wps">
+            <w:drawing>
+              <wp:anchor distT="0" distB="0" distL="114300" distR="114300" simplePos="0" relativeHeight="251658240" behindDoc="0" locked="0" layoutInCell="1" allowOverlap="1" wp14:anchorId="6FC521DC" wp14:editId="5EEB68C8">
+                <wp:simplePos x="0" y="0"/>
+                <wp:positionH relativeFrom="column">
+                  <wp:posOffset>38405</wp:posOffset>
+                </wp:positionH>
+                <wp:positionV relativeFrom="paragraph">
+                  <wp:posOffset>1498778</wp:posOffset>
+                </wp:positionV>
+                <wp:extent cx="899769" cy="197510"/>
+                <wp:effectExtent l="0" t="0" r="15240" b="12065"/>
+                <wp:wrapNone/>
+                <wp:docPr id="656364039" name="Rectangle 2"/>
+                <wp:cNvGraphicFramePr/>
+                <a:graphic xmlns:a="http://schemas.openxmlformats.org/drawingml/2006/main">
+                  <a:graphicData uri="http://schemas.microsoft.com/office/word/2010/wordprocessingShape">
+                    <wps:wsp>
+                      <wps:cNvSpPr/>
+                      <wps:spPr>
+                        <a:xfrm>
+                          <a:off x="0" y="0"/>
+                          <a:ext cx="899769" cy="197510"/>
+                        </a:xfrm>
+                        <a:prstGeom prst="rect">
+                          <a:avLst/>
+                        </a:prstGeom>
+                        <a:solidFill>
+                          <a:schemeClr val="lt1">
+                            <a:alpha val="0"/>
+                          </a:schemeClr>
+                        </a:solidFill>
+                      </wps:spPr>
+                      <wps:style>
+                        <a:lnRef idx="2">
+                          <a:schemeClr val="accent2"/>
+                        </a:lnRef>
+                        <a:fillRef idx="1">
+                          <a:schemeClr val="lt1"/>
+                        </a:fillRef>
+                        <a:effectRef idx="0">
+                          <a:schemeClr val="accent2"/>
+                        </a:effectRef>
+                        <a:fontRef idx="minor">
+                          <a:schemeClr val="dk1"/>
+                        </a:fontRef>
+                      </wps:style>
+                      <wps:bodyPr rot="0" spcFirstLastPara="0" vertOverflow="overflow" horzOverflow="overflow" vert="horz" wrap="square" lIns="91440" tIns="45720" rIns="91440" bIns="45720" numCol="1" spcCol="0" rtlCol="0" fromWordArt="0" anchor="ctr" anchorCtr="0" forceAA="0" compatLnSpc="1">
+                        <a:prstTxWarp prst="textNoShape">
+                          <a:avLst/>
+                        </a:prstTxWarp>
+                        <a:noAutofit/>
+                      </wps:bodyPr>
+                    </wps:wsp>
+                  </a:graphicData>
+                </a:graphic>
+              </wp:anchor>
+            </w:drawing>
+          </mc:Choice>
+          <mc:Fallback>
+            <w:pict>
+              <v:rect w14:anchorId="40C141D6" id="Rectangle 2" o:spid="_x0000_s1026" style="position:absolute;margin-left:3pt;margin-top:118pt;width:70.85pt;height:15.55pt;z-index:251658240;visibility:visible;mso-wrap-style:square;mso-wrap-distance-left:9pt;mso-wrap-distance-top:0;mso-wrap-distance-right:9pt;mso-wrap-distance-bottom:0;mso-position-horizontal:absolute;mso-position-horizontal-relative:text;mso-position-vertical:absolute;mso-position-vertical-relative:text;v-text-anchor:middle" o:gfxdata="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" fillcolor="white [3201]" strokecolor="#c0504d [3205]" strokeweight="2pt">
+                <v:fill opacity="0"/>
+              </v:rect>
+            </w:pict>
+          </mc:Fallback>
+        </mc:AlternateContent>
+      </w:r>
+      <w:r>
+        <w:drawing>
+          <wp:inline distT="0" distB="0" distL="0" distR="0" wp14:anchorId="7A8D1BA9" wp14:editId="71D5EBAE">
+            <wp:extent cx="5991225" cy="2974810"/>
+            <wp:effectExtent l="0" t="0" r="0" b="0"/>
+            <wp:docPr id="1988512739" name="Picture 1"/>
+            <wp:cNvGraphicFramePr>
+              <a:graphicFrameLocks xmlns:a="http://schemas.openxmlformats.org/drawingml/2006/main" noChangeAspect="1"/>
+            </wp:cNvGraphicFramePr>
+            <a:graphic xmlns:a="http://schemas.openxmlformats.org/drawingml/2006/main">
+              <a:graphicData uri="http://schemas.openxmlformats.org/drawingml/2006/picture">
+                <pic:pic xmlns:pic="http://schemas.openxmlformats.org/drawingml/2006/picture">
+                  <pic:nvPicPr>
+                    <pic:cNvPr id="1988512739" name=""/>
+                    <pic:cNvPicPr/>
+                  </pic:nvPicPr>
+                  <pic:blipFill>
+                    <a:blip r:embed="rId9"/>
+                    <a:stretch>
+                      <a:fillRect/>
+                    </a:stretch>
+                  </pic:blipFill>
+                  <pic:spPr>
+                    <a:xfrm>
+                      <a:off x="0" y="0"/>
+                      <a:ext cx="5997286" cy="2977819"/>
+                    </a:xfrm>
+                    <a:prstGeom prst="rect">
+                      <a:avLst/>
+                    </a:prstGeom>
+                  </pic:spPr>
+                </pic:pic>
+              </a:graphicData>
+            </a:graphic>
+          </wp:inline>
+        </w:drawing>
+      </w:r>
+    </w:p>
+    <w:p>
+      <w:pPr>
+        <w:pStyle w:val="ListNumber"/>
+        <w:numPr>
+          <w:ilvl w:val="0"/>
+          <w:numId w:val="0"/>
+        </w:numPr>
+        <w:ind w:left="360"/>
+      </w:pPr>
+    </w:p>
+    <w:p>
+      <w:pPr>
+        <w:pStyle w:val="ListNumber"/>
+        <w:numPr>
+          <w:ilvl w:val="0"/>
+          <w:numId w:val="0"/>
+        </w:numPr>
+        <w:ind w:left="360"/>
+      </w:pPr>
+      <w:r>
+        <w:rPr>
+          <w:noProof/>
+        </w:rPr>
+        <mc:AlternateContent>
+          <mc:Choice Requires="wps">
+            <w:drawing>
+              <wp:anchor distT="0" distB="0" distL="114300" distR="114300" simplePos="0" relativeHeight="251659264" behindDoc="0" locked="0" layoutInCell="1" allowOverlap="1" wp14:anchorId="19120700" wp14:editId="24E72825">
+                <wp:simplePos x="0" y="0"/>
+                <wp:positionH relativeFrom="column">
+                  <wp:posOffset>5590642</wp:posOffset>
+                </wp:positionH>
+                <wp:positionV relativeFrom="paragraph">
+                  <wp:posOffset>1809242</wp:posOffset>
+                </wp:positionV>
+                <wp:extent cx="643737" cy="256007"/>
+                <wp:effectExtent l="0" t="0" r="23495" b="10795"/>
+                <wp:wrapNone/>
+                <wp:docPr id="1451102297" name="Rectangle 2"/>
+                <wp:cNvGraphicFramePr/>
+                <a:graphic xmlns:a="http://schemas.openxmlformats.org/drawingml/2006/main">
+                  <a:graphicData uri="http://schemas.microsoft.com/office/word/2010/wordprocessingShape">
+                    <wps:wsp>
+                      <wps:cNvSpPr/>
+                      <wps:spPr>
+                        <a:xfrm>
+                          <a:off x="0" y="0"/>
+                          <a:ext cx="643737" cy="256007"/>
+                        </a:xfrm>
+                        <a:prstGeom prst="rect">
+                          <a:avLst/>
+                        </a:prstGeom>
+                        <a:solidFill>
+                          <a:schemeClr val="lt1">
+                            <a:alpha val="0"/>
+                          </a:schemeClr>
+                        </a:solidFill>
+                      </wps:spPr>
+                      <wps:style>
+                        <a:lnRef idx="2">
+                          <a:schemeClr val="accent2"/>
+                        </a:lnRef>
+                        <a:fillRef idx="1">
+                          <a:schemeClr val="lt1"/>
+                        </a:fillRef>
+                        <a:effectRef idx="0">
+                          <a:schemeClr val="accent2"/>
+                        </a:effectRef>
+                        <a:fontRef idx="minor">
+                          <a:schemeClr val="dk1"/>
+                        </a:fontRef>
+                      </wps:style>
+                      <wps:bodyPr rot="0" spcFirstLastPara="0" vertOverflow="overflow" horzOverflow="overflow" vert="horz" wrap="square" lIns="91440" tIns="45720" rIns="91440" bIns="45720" numCol="1" spcCol="0" rtlCol="0" fromWordArt="0" anchor="ctr" anchorCtr="0" forceAA="0" compatLnSpc="1">
+                        <a:prstTxWarp prst="textNoShape">
+                          <a:avLst/>
+                        </a:prstTxWarp>
+                        <a:noAutofit/>
+                      </wps:bodyPr>
+                    </wps:wsp>
+                  </a:graphicData>
+                </a:graphic>
+                <wp14:sizeRelH relativeFrom="margin">
+                  <wp14:pctWidth>0</wp14:pctWidth>
+                </wp14:sizeRelH>
+                <wp14:sizeRelV relativeFrom="margin">
+                  <wp14:pctHeight>0</wp14:pctHeight>
+                </wp14:sizeRelV>
+              </wp:anchor>
+            </w:drawing>
+          </mc:Choice>
+          <mc:Fallback>
+            <w:pict>
+              <v:rect w14:anchorId="7881F3E6" id="Rectangle 2" o:spid="_x0000_s1026" style="position:absolute;margin-left:440.2pt;margin-top:142.45pt;width:50.7pt;height:20.15pt;z-index:251659264;visibility:visible;mso-wrap-style:square;mso-width-percent:0;mso-height-percent:0;mso-wrap-distance-left:9pt;mso-wrap-distance-top:0;mso-wrap-distance-right:9pt;mso-wrap-distance-bottom:0;mso-position-horizontal:absolute;mso-position-horizontal-relative:text;mso-position-vertical:absolute;mso-position-vertical-relative:text;mso-width-percent:0;mso-height-percent:0;mso-width-relative:margin;mso-height-relative:margin;v-text-anchor:middle" o:gfxdata="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" fillcolor="white [3201]" strokecolor="#c0504d [3205]" strokeweight="2pt">
+                <v:fill opacity="0"/>
+              </v:rect>
+            </w:pict>
+          </mc:Fallback>
+        </mc:AlternateContent>
+      </w:r>
+      <w:r>
+        <w:drawing>
+          <wp:inline distT="0" distB="0" distL="0" distR="0" wp14:anchorId="0B2315A9" wp14:editId="65848D12">
+            <wp:extent cx="5905500" cy="3174206"/>
+            <wp:effectExtent l="0" t="0" r="0" b="7620"/>
+            <wp:docPr id="119837239" name="Picture 1"/>
+            <wp:cNvGraphicFramePr>
+              <a:graphicFrameLocks xmlns:a="http://schemas.openxmlformats.org/drawingml/2006/main" noChangeAspect="1"/>
+            </wp:cNvGraphicFramePr>
+            <a:graphic xmlns:a="http://schemas.openxmlformats.org/drawingml/2006/main">
+              <a:graphicData uri="http://schemas.openxmlformats.org/drawingml/2006/picture">
+                <pic:pic xmlns:pic="http://schemas.openxmlformats.org/drawingml/2006/picture">
+                  <pic:nvPicPr>
+                    <pic:cNvPr id="119837239" name=""/>
+                    <pic:cNvPicPr/>
+                  </pic:nvPicPr>
+                  <pic:blipFill>
+                    <a:blip r:embed="rId10"/>
+                    <a:stretch>
+                      <a:fillRect/>
+                    </a:stretch>
+                  </pic:blipFill>
+                  <pic:spPr>
+                    <a:xfrm>
+                      <a:off x="0" y="0"/>
+                      <a:ext cx="5923773" cy="3184027"/>
+                    </a:xfrm>
+                    <a:prstGeom prst="rect">
+                      <a:avLst/>
+                    </a:prstGeom>
+                  </pic:spPr>
+                </pic:pic>
+              </a:graphicData>
+            </a:graphic>
+          </wp:inline>
+        </w:drawing>
+      </w:r>
+    </w:p>
+    <w:p>
+      <w:pPr>
+        <w:pStyle w:val="ListNumber"/>
+        <w:numPr>
+          <w:ilvl w:val="0"/>
+          <w:numId w:val="0"/>
+        </w:numPr>
+        <w:ind w:left="360"/>
+      </w:pPr>
+    </w:p>
+    <w:p>
+      <w:pPr>
+        <w:pStyle w:val="ListNumber"/>
+        <w:numPr>
+          <w:ilvl w:val="0"/>
+          <w:numId w:val="0"/>
+        </w:numPr>
+        <w:ind w:left="360"/>
+      </w:pPr>
+    </w:p>
+    <w:p>
+      <w:pPr>
+        <w:pStyle w:val="ListNumber"/>
+        <w:numPr>
+          <w:ilvl w:val="0"/>
+          <w:numId w:val="0"/>
+        </w:numPr>
+        <w:ind w:left="360"/>
+      </w:pPr>
+    </w:p>
+    <w:p>
+      <w:pPr>
+        <w:pStyle w:val="ListNumber"/>
+        <w:numPr>
+          <w:ilvl w:val="0"/>
+          <w:numId w:val="0"/>
+        </w:numPr>
+        <w:ind w:left="360"/>
+      </w:pPr>
+    </w:p>
+    <w:p>
+      <w:pPr>
+        <w:pStyle w:val="ListNumber"/>
+        <w:numPr>
+          <w:ilvl w:val="0"/>
+          <w:numId w:val="0"/>
+        </w:numPr>
+        <w:ind w:left="360"/>
+      </w:pPr>
+    </w:p>
+    <w:p>
+      <w:pPr>
+        <w:pStyle w:val="ListNumber"/>
+        <w:numPr>
+          <w:ilvl w:val="0"/>
+          <w:numId w:val="0"/>
+        </w:numPr>
+        <w:ind w:left="360"/>
+      </w:pPr>
+    </w:p>
+    <w:p>
+      <w:pPr>
+        <w:pStyle w:val="ListNumber"/>
+        <w:numPr>
+          <w:ilvl w:val="0"/>
+          <w:numId w:val="0"/>
+        </w:numPr>
+        <w:ind w:left="360"/>
+      </w:pPr>
+    </w:p>
+    <w:p>
+      <w:pPr>
+        <w:pStyle w:val="ListNumber"/>
+        <w:numPr>
+          <w:ilvl w:val="0"/>
+          <w:numId w:val="0"/>
+        </w:numPr>
+        <w:ind w:left="360"/>
+      </w:pPr>
+    </w:p>
+    <w:p>
+      <w:pPr>
+        <w:pStyle w:val="ListNumber"/>
+        <w:numPr>
+          <w:ilvl w:val="0"/>
+          <w:numId w:val="0"/>
+        </w:numPr>
+        <w:ind w:left="360"/>
+      </w:pPr>
+    </w:p>
+    <w:p>
+      <w:pPr>
+        <w:pStyle w:val="ListNumber"/>
+        <w:numPr>
+          <w:ilvl w:val="0"/>
+          <w:numId w:val="0"/>
+        </w:numPr>
+        <w:ind w:left="360"/>
+      </w:pPr>
+    </w:p>
+    <w:p>
+      <w:pPr>
+        <w:pStyle w:val="ListNumber"/>
+      </w:pPr>
+      <w:r>
+        <w:lastRenderedPageBreak/>
         <w:t>Choose batch-level or accession-level report generation.</w:t>
       </w:r>
     </w:p>
     <w:p>
       <w:pPr>
         <w:pStyle w:val="ListNumber"/>
+        <w:numPr>
+          <w:ilvl w:val="0"/>
+          <w:numId w:val="0"/>
+        </w:numPr>
+        <w:ind w:left="360"/>
+      </w:pPr>
+      <w:r>
+        <w:drawing>
+          <wp:inline distT="0" distB="0" distL="0" distR="0" wp14:anchorId="1853FA74" wp14:editId="1AD63BE1">
+            <wp:extent cx="5544922" cy="2980396"/>
+            <wp:effectExtent l="0" t="0" r="0" b="0"/>
+            <wp:docPr id="1286658513" name="Picture 1"/>
+            <wp:cNvGraphicFramePr>
+              <a:graphicFrameLocks xmlns:a="http://schemas.openxmlformats.org/drawingml/2006/main" noChangeAspect="1"/>
+            </wp:cNvGraphicFramePr>
+            <a:graphic xmlns:a="http://schemas.openxmlformats.org/drawingml/2006/main">
+              <a:graphicData uri="http://schemas.openxmlformats.org/drawingml/2006/picture">
+                <pic:pic xmlns:pic="http://schemas.openxmlformats.org/drawingml/2006/picture">
+                  <pic:nvPicPr>
+                    <pic:cNvPr id="1286658513" name=""/>
+                    <pic:cNvPicPr/>
+                  </pic:nvPicPr>
+                  <pic:blipFill>
+                    <a:blip r:embed="rId11"/>
+                    <a:stretch>
+                      <a:fillRect/>
+                    </a:stretch>
+                  </pic:blipFill>
+                  <pic:spPr>
+                    <a:xfrm>
+                      <a:off x="0" y="0"/>
+                      <a:ext cx="5553405" cy="2984956"/>
+                    </a:xfrm>
+                    <a:prstGeom prst="rect">
+                      <a:avLst/>
+                    </a:prstGeom>
+                  </pic:spPr>
+                </pic:pic>
+              </a:graphicData>
+            </a:graphic>
+          </wp:inline>
+        </w:drawing>
+      </w:r>
+    </w:p>
+    <w:p>
+      <w:pPr>
+        <w:pStyle w:val="ListNumber"/>
+        <w:numPr>
+          <w:ilvl w:val="0"/>
+          <w:numId w:val="0"/>
+        </w:numPr>
+        <w:ind w:left="360"/>
+      </w:pPr>
+      <w:r>
+        <w:drawing>
+          <wp:inline distT="0" distB="0" distL="0" distR="0" wp14:anchorId="76122D2F" wp14:editId="5C1C5A9F">
+            <wp:extent cx="6261811" cy="3134360"/>
+            <wp:effectExtent l="0" t="0" r="5715" b="8890"/>
+            <wp:docPr id="362788083" name="Picture 1"/>
+            <wp:cNvGraphicFramePr>
+              <a:graphicFrameLocks xmlns:a="http://schemas.openxmlformats.org/drawingml/2006/main" noChangeAspect="1"/>
+            </wp:cNvGraphicFramePr>
+            <a:graphic xmlns:a="http://schemas.openxmlformats.org/drawingml/2006/main">
+              <a:graphicData uri="http://schemas.openxmlformats.org/drawingml/2006/picture">
+                <pic:pic xmlns:pic="http://schemas.openxmlformats.org/drawingml/2006/picture">
+                  <pic:nvPicPr>
+                    <pic:cNvPr id="362788083" name=""/>
+                    <pic:cNvPicPr/>
+                  </pic:nvPicPr>
+                  <pic:blipFill>
+                    <a:blip r:embed="rId12"/>
+                    <a:stretch>
+                      <a:fillRect/>
+                    </a:stretch>
+                  </pic:blipFill>
+                  <pic:spPr>
+                    <a:xfrm>
+                      <a:off x="0" y="0"/>
+                      <a:ext cx="6269296" cy="3138107"/>
+                    </a:xfrm>
+                    <a:prstGeom prst="rect">
+                      <a:avLst/>
+                    </a:prstGeom>
+                  </pic:spPr>
+                </pic:pic>
+              </a:graphicData>
+            </a:graphic>
+          </wp:inline>
+        </w:drawing>
+      </w:r>
+    </w:p>
+    <w:p>
+      <w:pPr>
+        <w:pStyle w:val="ListNumber"/>
       </w:pPr>
       <w:r>
         <w:t>Review organism concordance, genus/species concordance, AST concordance, and detailed discrepancies.</w:t>
       </w:r>
+    </w:p>
+    <w:p>
+      <w:pPr>
+        <w:pStyle w:val="ListNumber"/>
+        <w:numPr>
+          <w:ilvl w:val="0"/>
+          <w:numId w:val="0"/>
+        </w:numPr>
+        <w:ind w:left="360"/>
+      </w:pPr>
+      <w:r>
+        <w:lastRenderedPageBreak/>
+        <w:drawing>
+          <wp:inline distT="0" distB="0" distL="0" distR="0" wp14:anchorId="2FF0EC27" wp14:editId="6D8659E1">
+            <wp:extent cx="4637837" cy="5262197"/>
+            <wp:effectExtent l="0" t="0" r="0" b="0"/>
+            <wp:docPr id="576477169" name="Picture 1"/>
+            <wp:cNvGraphicFramePr>
+              <a:graphicFrameLocks xmlns:a="http://schemas.openxmlformats.org/drawingml/2006/main" noChangeAspect="1"/>
+            </wp:cNvGraphicFramePr>
+            <a:graphic xmlns:a="http://schemas.openxmlformats.org/drawingml/2006/main">
+              <a:graphicData uri="http://schemas.openxmlformats.org/drawingml/2006/picture">
+                <pic:pic xmlns:pic="http://schemas.openxmlformats.org/drawingml/2006/picture">
+                  <pic:nvPicPr>
+                    <pic:cNvPr id="576477169" name=""/>
+                    <pic:cNvPicPr/>
+                  </pic:nvPicPr>
+                  <pic:blipFill>
+                    <a:blip r:embed="rId13"/>
+                    <a:stretch>
+                      <a:fillRect/>
+                    </a:stretch>
+                  </pic:blipFill>
+                  <pic:spPr>
+                    <a:xfrm>
+                      <a:off x="0" y="0"/>
+                      <a:ext cx="4641888" cy="5266794"/>
+                    </a:xfrm>
+                    <a:prstGeom prst="rect">
+                      <a:avLst/>
+                    </a:prstGeom>
+                  </pic:spPr>
+                </pic:pic>
+              </a:graphicData>
+            </a:graphic>
+          </wp:inline>
+        </w:drawing>
+      </w:r>
+    </w:p>
+    <w:p>
+      <w:pPr>
+        <w:pStyle w:val="ListNumber"/>
+        <w:numPr>
+          <w:ilvl w:val="0"/>
+          <w:numId w:val="0"/>
+        </w:numPr>
+        <w:ind w:left="360"/>
+      </w:pPr>
+      <w:r>
+        <w:lastRenderedPageBreak/>
+        <w:drawing>
+          <wp:inline distT="0" distB="0" distL="0" distR="0" wp14:anchorId="78A0D0C2" wp14:editId="24089168">
+            <wp:extent cx="4593946" cy="5618925"/>
+            <wp:effectExtent l="0" t="0" r="0" b="1270"/>
+            <wp:docPr id="154120166" name="Picture 1"/>
+            <wp:cNvGraphicFramePr>
+              <a:graphicFrameLocks xmlns:a="http://schemas.openxmlformats.org/drawingml/2006/main" noChangeAspect="1"/>
+            </wp:cNvGraphicFramePr>
+            <a:graphic xmlns:a="http://schemas.openxmlformats.org/drawingml/2006/main">
+              <a:graphicData uri="http://schemas.openxmlformats.org/drawingml/2006/picture">
+                <pic:pic xmlns:pic="http://schemas.openxmlformats.org/drawingml/2006/picture">
+                  <pic:nvPicPr>
+                    <pic:cNvPr id="154120166" name=""/>
+                    <pic:cNvPicPr/>
+                  </pic:nvPicPr>
+                  <pic:blipFill>
+                    <a:blip r:embed="rId14"/>
+                    <a:stretch>
+                      <a:fillRect/>
+                    </a:stretch>
+                  </pic:blipFill>
+                  <pic:spPr>
+                    <a:xfrm>
+                      <a:off x="0" y="0"/>
+                      <a:ext cx="4599655" cy="5625908"/>
+                    </a:xfrm>
+                    <a:prstGeom prst="rect">
+                      <a:avLst/>
+                    </a:prstGeom>
+                  </pic:spPr>
+                </pic:pic>
+              </a:graphicData>
+            </a:graphic>
+          </wp:inline>
+        </w:drawing>
+      </w:r>
+    </w:p>
+    <w:p>
+      <w:pPr>
+        <w:pStyle w:val="ListNumber"/>
+        <w:numPr>
+          <w:ilvl w:val="0"/>
+          <w:numId w:val="0"/>
+        </w:numPr>
+        <w:ind w:left="360"/>
+      </w:pPr>
     </w:p>
     <w:p>
       <w:pPr>
@@ -3655,6 +4207,7 @@
         <w:pStyle w:val="Heading1"/>
       </w:pPr>
       <w:r>
+        <w:lastRenderedPageBreak/>
         <w:t>13. TAT monitoring</w:t>
       </w:r>
     </w:p>
@@ -3958,7 +4511,6 @@
         <w:pStyle w:val="ListNumber"/>
       </w:pPr>
       <w:r>
-        <w:lastRenderedPageBreak/>
         <w:t>Locate the batch or accession.</w:t>
       </w:r>
     </w:p>
@@ -4365,7 +4917,15 @@
                 <w:color w:val="000000"/>
                 <w:sz w:val="17"/>
               </w:rPr>
-              <w:t>Export emerging accessions, referral date range, antibiotics, and Resistance Phenotype.</w:t>
+              <w:t xml:space="preserve">Export emerging accessions, referral date range, antibiotics, and Resistance </w:t>
+            </w:r>
+            <w:r>
+              <w:rPr>
+                <w:color w:val="000000"/>
+                <w:sz w:val="17"/>
+              </w:rPr>
+              <w:lastRenderedPageBreak/>
+              <w:t>Phenotype.</w:t>
             </w:r>
           </w:p>
         </w:tc>
@@ -4384,6 +4944,7 @@
                 <w:color w:val="000000"/>
                 <w:sz w:val="17"/>
               </w:rPr>
+              <w:lastRenderedPageBreak/>
               <w:t>WGS matched data</w:t>
             </w:r>
           </w:p>
@@ -4725,7 +5286,6 @@
                 <w:color w:val="000000"/>
                 <w:sz w:val="17"/>
               </w:rPr>
-              <w:lastRenderedPageBreak/>
               <w:t>Upload fails or stops</w:t>
             </w:r>
           </w:p>
@@ -5322,8 +5882,8 @@
       </w:r>
     </w:p>
     <w:sectPr>
-      <w:headerReference w:type="default" r:id="rId9"/>
-      <w:footerReference w:type="default" r:id="rId10"/>
+      <w:headerReference w:type="default" r:id="rId15"/>
+      <w:footerReference w:type="default" r:id="rId16"/>
       <w:pgSz w:w="12240" w:h="15840"/>
       <w:pgMar w:top="1080" w:right="1080" w:bottom="1080" w:left="1080" w:header="648" w:footer="648" w:gutter="0"/>
       <w:cols w:space="720"/>
@@ -5334,7 +5894,7 @@
 </file>
 
 <file path=word/endnotes.xml><?xml version="1.0" encoding="utf-8"?>
-<w:endnotes xmlns:wpc="http://schemas.microsoft.com/office/word/2010/wordprocessingCanvas" xmlns:cx="http://schemas.microsoft.com/office/drawing/2014/chartex" xmlns:cx1="http://schemas.microsoft.com/office/drawing/2015/9/8/chartex" xmlns:cx2="http://schemas.microsoft.com/office/drawing/2015/10/21/chartex" xmlns:cx3="http://schemas.microsoft.com/office/drawing/2016/5/9/chartex" xmlns:cx4="http://schemas.microsoft.com/office/drawing/2016/5/10/chartex" xmlns:cx5="http://schemas.microsoft.com/office/drawing/2016/5/11/chartex" xmlns:cx6="http://schemas.microsoft.com/office/drawing/2016/5/12/chartex" xmlns:cx7="http://schemas.microsoft.com/office/drawing/2016/5/13/chartex" xmlns:cx8="http://schemas.microsoft.com/office/drawing/2016/5/14/chartex" xmlns:mc="http://schemas.openxmlformats.org/markup-compatibility/2006" xmlns:aink="http://schemas.microsoft.com/office/drawing/2016/ink" xmlns:am3d="http://schemas.microsoft.com/office/drawing/2017/model3d" xmlns:o="urn:schemas-microsoft-com:office:office" xmlns:oel="http://schemas.microsoft.com/office/2019/extlst" xmlns:r="http://schemas.openxmlformats.org/officeDocument/2006/relationships" xmlns:m="http://schemas.openxmlformats.org/officeDocument/2006/math" xmlns:v="urn:schemas-microsoft-com:vml" xmlns:wp14="http://schemas.microsoft.com/office/word/2010/wordprocessingDrawing" xmlns:wp="http://schemas.openxmlformats.org/drawingml/2006/wordprocessingDrawing" xmlns:w10="urn:schemas-microsoft-com:office:word" xmlns:w="http://schemas.openxmlformats.org/wordprocessingml/2006/main" xmlns:w14="http://schemas.microsoft.com/office/word/2010/wordml" xmlns:w15="http://schemas.microsoft.com/office/word/2012/wordml" xmlns:w16cex="http://schemas.microsoft.com/office/word/2018/wordml/cex" xmlns:w16cid="http://schemas.microsoft.com/office/word/2016/wordml/cid" xmlns:w16="http://schemas.microsoft.com/office/word/2018/wordml" xmlns:w16du="http://schemas.microsoft.com/office/word/2023/wordml/word16du" xmlns:w16sdtdh="http://schemas.microsoft.com/office/word/2020/wordml/sdtdatahash" xmlns:w16sdtfl="http://schemas.microsoft.com/office/word/2024/wordml/sdtformatlock" xmlns:w16se="http://schemas.microsoft.com/office/word/2015/wordml/symex" xmlns:wpg="http://schemas.microsoft.com/office/word/2010/wordprocessingGroup" xmlns:wpi="http://schemas.microsoft.com/office/word/2010/wordprocessingInk" xmlns:wne="http://schemas.microsoft.com/office/word/2006/wordml" xmlns:wps="http://schemas.microsoft.com/office/word/2010/wordprocessingShape" mc:Ignorable="w14 w15 w16se w16cid w16 w16cex w16sdtdh w16sdtfl w16du wp14">
+<w:endnotes xmlns:wpc="http://schemas.microsoft.com/office/word/2010/wordprocessingCanvas" xmlns:cx="http://schemas.microsoft.com/office/drawing/2014/chartex" xmlns:cx1="http://schemas.microsoft.com/office/drawing/2015/9/8/chartex" xmlns:cx2="http://schemas.microsoft.com/office/drawing/2015/10/21/chartex" xmlns:cx3="http://schemas.microsoft.com/office/drawing/2016/5/9/chartex" xmlns:cx4="http://schemas.microsoft.com/office/drawing/2016/5/10/chartex" xmlns:cx5="http://schemas.microsoft.com/office/drawing/2016/5/11/chartex" xmlns:cx6="http://schemas.microsoft.com/office/drawing/2016/5/12/chartex" xmlns:cx7="http://schemas.microsoft.com/office/drawing/2016/5/13/chartex" xmlns:cx8="http://schemas.microsoft.com/office/drawing/2016/5/14/chartex" xmlns:mc="http://schemas.openxmlformats.org/markup-compatibility/2006" xmlns:aink="http://schemas.microsoft.com/office/drawing/2016/ink" xmlns:am3d="http://schemas.microsoft.com/office/drawing/2017/model3d" xmlns:o="urn:schemas-microsoft-com:office:office" xmlns:oel="http://schemas.microsoft.com/office/2019/extlst" xmlns:r="http://schemas.openxmlformats.org/officeDocument/2006/relationships" xmlns:m="http://schemas.openxmlformats.org/officeDocument/2006/math" xmlns:v="urn:schemas-microsoft-com:vml" xmlns:wp14="http://schemas.microsoft.com/office/word/2010/wordprocessingDrawing" xmlns:wp="http://schemas.openxmlformats.org/drawingml/2006/wordprocessingDrawing" xmlns:w10="urn:schemas-microsoft-com:office:word" xmlns:w="http://schemas.openxmlformats.org/wordprocessingml/2006/main" xmlns:w14="http://schemas.microsoft.com/office/word/2010/wordml" xmlns:w15="http://schemas.microsoft.com/office/word/2012/wordml" xmlns:w16cei="http://schemas.microsoft.com/office/word/2026/wordml/cei" xmlns:w16cex="http://schemas.microsoft.com/office/word/2018/wordml/cex" xmlns:w16cid="http://schemas.microsoft.com/office/word/2016/wordml/cid" xmlns:w16="http://schemas.microsoft.com/office/word/2018/wordml" xmlns:w16du="http://schemas.microsoft.com/office/word/2023/wordml/word16du" xmlns:w16sdtdh="http://schemas.microsoft.com/office/word/2020/wordml/sdtdatahash" xmlns:w16sdtfl="http://schemas.microsoft.com/office/word/2024/wordml/sdtformatlock" xmlns:w16se="http://schemas.microsoft.com/office/word/2015/wordml/symex" xmlns:wpg="http://schemas.microsoft.com/office/word/2010/wordprocessingGroup" xmlns:wpi="http://schemas.microsoft.com/office/word/2010/wordprocessingInk" xmlns:wne="http://schemas.microsoft.com/office/word/2006/wordml" xmlns:wps="http://schemas.microsoft.com/office/word/2010/wordprocessingShape" mc:Ignorable="w14 w15 w16se w16cid w16 w16cex w16sdtdh w16sdtfl w16du wp14">
   <w:endnote w:type="separator" w:id="-1">
     <w:p>
       <w:pPr>
@@ -5359,7 +5919,7 @@
 </file>
 
 <file path=word/footer1.xml><?xml version="1.0" encoding="utf-8"?>
-<w:ftr xmlns:wpc="http://schemas.microsoft.com/office/word/2010/wordprocessingCanvas" xmlns:cx="http://schemas.microsoft.com/office/drawing/2014/chartex" xmlns:cx1="http://schemas.microsoft.com/office/drawing/2015/9/8/chartex" xmlns:cx2="http://schemas.microsoft.com/office/drawing/2015/10/21/chartex" xmlns:cx3="http://schemas.microsoft.com/office/drawing/2016/5/9/chartex" xmlns:cx4="http://schemas.microsoft.com/office/drawing/2016/5/10/chartex" xmlns:cx5="http://schemas.microsoft.com/office/drawing/2016/5/11/chartex" xmlns:cx6="http://schemas.microsoft.com/office/drawing/2016/5/12/chartex" xmlns:cx7="http://schemas.microsoft.com/office/drawing/2016/5/13/chartex" xmlns:cx8="http://schemas.microsoft.com/office/drawing/2016/5/14/chartex" xmlns:mc="http://schemas.openxmlformats.org/markup-compatibility/2006" xmlns:aink="http://schemas.microsoft.com/office/drawing/2016/ink" xmlns:am3d="http://schemas.microsoft.com/office/drawing/2017/model3d" xmlns:o="urn:schemas-microsoft-com:office:office" xmlns:oel="http://schemas.microsoft.com/office/2019/extlst" xmlns:r="http://schemas.openxmlformats.org/officeDocument/2006/relationships" xmlns:m="http://schemas.openxmlformats.org/officeDocument/2006/math" xmlns:v="urn:schemas-microsoft-com:vml" xmlns:wp14="http://schemas.microsoft.com/office/word/2010/wordprocessingDrawing" xmlns:wp="http://schemas.openxmlformats.org/drawingml/2006/wordprocessingDrawing" xmlns:w10="urn:schemas-microsoft-com:office:word" xmlns:w="http://schemas.openxmlformats.org/wordprocessingml/2006/main" xmlns:w14="http://schemas.microsoft.com/office/word/2010/wordml" xmlns:w15="http://schemas.microsoft.com/office/word/2012/wordml" xmlns:w16cex="http://schemas.microsoft.com/office/word/2018/wordml/cex" xmlns:w16cid="http://schemas.microsoft.com/office/word/2016/wordml/cid" xmlns:w16="http://schemas.microsoft.com/office/word/2018/wordml" xmlns:w16du="http://schemas.microsoft.com/office/word/2023/wordml/word16du" xmlns:w16sdtdh="http://schemas.microsoft.com/office/word/2020/wordml/sdtdatahash" xmlns:w16sdtfl="http://schemas.microsoft.com/office/word/2024/wordml/sdtformatlock" xmlns:w16se="http://schemas.microsoft.com/office/word/2015/wordml/symex" xmlns:wpg="http://schemas.microsoft.com/office/word/2010/wordprocessingGroup" xmlns:wpi="http://schemas.microsoft.com/office/word/2010/wordprocessingInk" xmlns:wne="http://schemas.microsoft.com/office/word/2006/wordml" xmlns:wps="http://schemas.microsoft.com/office/word/2010/wordprocessingShape" mc:Ignorable="w14 w15 w16se w16cid w16 w16cex w16sdtdh w16sdtfl w16du wp14">
+<w:ftr xmlns:wpc="http://schemas.microsoft.com/office/word/2010/wordprocessingCanvas" xmlns:cx="http://schemas.microsoft.com/office/drawing/2014/chartex" xmlns:cx1="http://schemas.microsoft.com/office/drawing/2015/9/8/chartex" xmlns:cx2="http://schemas.microsoft.com/office/drawing/2015/10/21/chartex" xmlns:cx3="http://schemas.microsoft.com/office/drawing/2016/5/9/chartex" xmlns:cx4="http://schemas.microsoft.com/office/drawing/2016/5/10/chartex" xmlns:cx5="http://schemas.microsoft.com/office/drawing/2016/5/11/chartex" xmlns:cx6="http://schemas.microsoft.com/office/drawing/2016/5/12/chartex" xmlns:cx7="http://schemas.microsoft.com/office/drawing/2016/5/13/chartex" xmlns:cx8="http://schemas.microsoft.com/office/drawing/2016/5/14/chartex" xmlns:mc="http://schemas.openxmlformats.org/markup-compatibility/2006" xmlns:aink="http://schemas.microsoft.com/office/drawing/2016/ink" xmlns:am3d="http://schemas.microsoft.com/office/drawing/2017/model3d" xmlns:o="urn:schemas-microsoft-com:office:office" xmlns:oel="http://schemas.microsoft.com/office/2019/extlst" xmlns:r="http://schemas.openxmlformats.org/officeDocument/2006/relationships" xmlns:m="http://schemas.openxmlformats.org/officeDocument/2006/math" xmlns:v="urn:schemas-microsoft-com:vml" xmlns:wp14="http://schemas.microsoft.com/office/word/2010/wordprocessingDrawing" xmlns:wp="http://schemas.openxmlformats.org/drawingml/2006/wordprocessingDrawing" xmlns:w10="urn:schemas-microsoft-com:office:word" xmlns:w="http://schemas.openxmlformats.org/wordprocessingml/2006/main" xmlns:w14="http://schemas.microsoft.com/office/word/2010/wordml" xmlns:w15="http://schemas.microsoft.com/office/word/2012/wordml" xmlns:w16cei="http://schemas.microsoft.com/office/word/2026/wordml/cei" xmlns:w16cex="http://schemas.microsoft.com/office/word/2018/wordml/cex" xmlns:w16cid="http://schemas.microsoft.com/office/word/2016/wordml/cid" xmlns:w16="http://schemas.microsoft.com/office/word/2018/wordml" xmlns:w16du="http://schemas.microsoft.com/office/word/2023/wordml/word16du" xmlns:w16sdtdh="http://schemas.microsoft.com/office/word/2020/wordml/sdtdatahash" xmlns:w16sdtfl="http://schemas.microsoft.com/office/word/2024/wordml/sdtformatlock" xmlns:w16se="http://schemas.microsoft.com/office/word/2015/wordml/symex" xmlns:wpg="http://schemas.microsoft.com/office/word/2010/wordprocessingGroup" xmlns:wpi="http://schemas.microsoft.com/office/word/2010/wordprocessingInk" xmlns:wne="http://schemas.microsoft.com/office/word/2006/wordml" xmlns:wps="http://schemas.microsoft.com/office/word/2010/wordprocessingShape" mc:Ignorable="w14 w15 w16se w16cid w16 w16cex w16sdtdh w16sdtfl w16du wp14">
   <w:p>
     <w:pPr>
       <w:pStyle w:val="Footer"/>
@@ -5377,7 +5937,7 @@
 </file>
 
 <file path=word/footnotes.xml><?xml version="1.0" encoding="utf-8"?>
-<w:footnotes xmlns:wpc="http://schemas.microsoft.com/office/word/2010/wordprocessingCanvas" xmlns:cx="http://schemas.microsoft.com/office/drawing/2014/chartex" xmlns:cx1="http://schemas.microsoft.com/office/drawing/2015/9/8/chartex" xmlns:cx2="http://schemas.microsoft.com/office/drawing/2015/10/21/chartex" xmlns:cx3="http://schemas.microsoft.com/office/drawing/2016/5/9/chartex" xmlns:cx4="http://schemas.microsoft.com/office/drawing/2016/5/10/chartex" xmlns:cx5="http://schemas.microsoft.com/office/drawing/2016/5/11/chartex" xmlns:cx6="http://schemas.microsoft.com/office/drawing/2016/5/12/chartex" xmlns:cx7="http://schemas.microsoft.com/office/drawing/2016/5/13/chartex" xmlns:cx8="http://schemas.microsoft.com/office/drawing/2016/5/14/chartex" xmlns:mc="http://schemas.openxmlformats.org/markup-compatibility/2006" xmlns:aink="http://schemas.microsoft.com/office/drawing/2016/ink" xmlns:am3d="http://schemas.microsoft.com/office/drawing/2017/model3d" xmlns:o="urn:schemas-microsoft-com:office:office" xmlns:oel="http://schemas.microsoft.com/office/2019/extlst" xmlns:r="http://schemas.openxmlformats.org/officeDocument/2006/relationships" xmlns:m="http://schemas.openxmlformats.org/officeDocument/2006/math" xmlns:v="urn:schemas-microsoft-com:vml" xmlns:wp14="http://schemas.microsoft.com/office/word/2010/wordprocessingDrawing" xmlns:wp="http://schemas.openxmlformats.org/drawingml/2006/wordprocessingDrawing" xmlns:w10="urn:schemas-microsoft-com:office:word" xmlns:w="http://schemas.openxmlformats.org/wordprocessingml/2006/main" xmlns:w14="http://schemas.microsoft.com/office/word/2010/wordml" xmlns:w15="http://schemas.microsoft.com/office/word/2012/wordml" xmlns:w16cex="http://schemas.microsoft.com/office/word/2018/wordml/cex" xmlns:w16cid="http://schemas.microsoft.com/office/word/2016/wordml/cid" xmlns:w16="http://schemas.microsoft.com/office/word/2018/wordml" xmlns:w16du="http://schemas.microsoft.com/office/word/2023/wordml/word16du" xmlns:w16sdtdh="http://schemas.microsoft.com/office/word/2020/wordml/sdtdatahash" xmlns:w16sdtfl="http://schemas.microsoft.com/office/word/2024/wordml/sdtformatlock" xmlns:w16se="http://schemas.microsoft.com/office/word/2015/wordml/symex" xmlns:wpg="http://schemas.microsoft.com/office/word/2010/wordprocessingGroup" xmlns:wpi="http://schemas.microsoft.com/office/word/2010/wordprocessingInk" xmlns:wne="http://schemas.microsoft.com/office/word/2006/wordml" xmlns:wps="http://schemas.microsoft.com/office/word/2010/wordprocessingShape" mc:Ignorable="w14 w15 w16se w16cid w16 w16cex w16sdtdh w16sdtfl w16du wp14">
+<w:footnotes xmlns:wpc="http://schemas.microsoft.com/office/word/2010/wordprocessingCanvas" xmlns:cx="http://schemas.microsoft.com/office/drawing/2014/chartex" xmlns:cx1="http://schemas.microsoft.com/office/drawing/2015/9/8/chartex" xmlns:cx2="http://schemas.microsoft.com/office/drawing/2015/10/21/chartex" xmlns:cx3="http://schemas.microsoft.com/office/drawing/2016/5/9/chartex" xmlns:cx4="http://schemas.microsoft.com/office/drawing/2016/5/10/chartex" xmlns:cx5="http://schemas.microsoft.com/office/drawing/2016/5/11/chartex" xmlns:cx6="http://schemas.microsoft.com/office/drawing/2016/5/12/chartex" xmlns:cx7="http://schemas.microsoft.com/office/drawing/2016/5/13/chartex" xmlns:cx8="http://schemas.microsoft.com/office/drawing/2016/5/14/chartex" xmlns:mc="http://schemas.openxmlformats.org/markup-compatibility/2006" xmlns:aink="http://schemas.microsoft.com/office/drawing/2016/ink" xmlns:am3d="http://schemas.microsoft.com/office/drawing/2017/model3d" xmlns:o="urn:schemas-microsoft-com:office:office" xmlns:oel="http://schemas.microsoft.com/office/2019/extlst" xmlns:r="http://schemas.openxmlformats.org/officeDocument/2006/relationships" xmlns:m="http://schemas.openxmlformats.org/officeDocument/2006/math" xmlns:v="urn:schemas-microsoft-com:vml" xmlns:wp14="http://schemas.microsoft.com/office/word/2010/wordprocessingDrawing" xmlns:wp="http://schemas.openxmlformats.org/drawingml/2006/wordprocessingDrawing" xmlns:w10="urn:schemas-microsoft-com:office:word" xmlns:w="http://schemas.openxmlformats.org/wordprocessingml/2006/main" xmlns:w14="http://schemas.microsoft.com/office/word/2010/wordml" xmlns:w15="http://schemas.microsoft.com/office/word/2012/wordml" xmlns:w16cei="http://schemas.microsoft.com/office/word/2026/wordml/cei" xmlns:w16cex="http://schemas.microsoft.com/office/word/2018/wordml/cex" xmlns:w16cid="http://schemas.microsoft.com/office/word/2016/wordml/cid" xmlns:w16="http://schemas.microsoft.com/office/word/2018/wordml" xmlns:w16du="http://schemas.microsoft.com/office/word/2023/wordml/word16du" xmlns:w16sdtdh="http://schemas.microsoft.com/office/word/2020/wordml/sdtdatahash" xmlns:w16sdtfl="http://schemas.microsoft.com/office/word/2024/wordml/sdtformatlock" xmlns:w16se="http://schemas.microsoft.com/office/word/2015/wordml/symex" xmlns:wpg="http://schemas.microsoft.com/office/word/2010/wordprocessingGroup" xmlns:wpi="http://schemas.microsoft.com/office/word/2010/wordprocessingInk" xmlns:wne="http://schemas.microsoft.com/office/word/2006/wordml" xmlns:wps="http://schemas.microsoft.com/office/word/2010/wordprocessingShape" mc:Ignorable="w14 w15 w16se w16cid w16 w16cex w16sdtdh w16sdtfl w16du wp14">
   <w:footnote w:type="separator" w:id="-1">
     <w:p>
       <w:pPr>
@@ -5402,7 +5962,7 @@
 </file>
 
 <file path=word/header1.xml><?xml version="1.0" encoding="utf-8"?>
-<w:hdr xmlns:wpc="http://schemas.microsoft.com/office/word/2010/wordprocessingCanvas" xmlns:cx="http://schemas.microsoft.com/office/drawing/2014/chartex" xmlns:cx1="http://schemas.microsoft.com/office/drawing/2015/9/8/chartex" xmlns:cx2="http://schemas.microsoft.com/office/drawing/2015/10/21/chartex" xmlns:cx3="http://schemas.microsoft.com/office/drawing/2016/5/9/chartex" xmlns:cx4="http://schemas.microsoft.com/office/drawing/2016/5/10/chartex" xmlns:cx5="http://schemas.microsoft.com/office/drawing/2016/5/11/chartex" xmlns:cx6="http://schemas.microsoft.com/office/drawing/2016/5/12/chartex" xmlns:cx7="http://schemas.microsoft.com/office/drawing/2016/5/13/chartex" xmlns:cx8="http://schemas.microsoft.com/office/drawing/2016/5/14/chartex" xmlns:mc="http://schemas.openxmlformats.org/markup-compatibility/2006" xmlns:aink="http://schemas.microsoft.com/office/drawing/2016/ink" xmlns:am3d="http://schemas.microsoft.com/office/drawing/2017/model3d" xmlns:o="urn:schemas-microsoft-com:office:office" xmlns:oel="http://schemas.microsoft.com/office/2019/extlst" xmlns:r="http://schemas.openxmlformats.org/officeDocument/2006/relationships" xmlns:m="http://schemas.openxmlformats.org/officeDocument/2006/math" xmlns:v="urn:schemas-microsoft-com:vml" xmlns:wp14="http://schemas.microsoft.com/office/word/2010/wordprocessingDrawing" xmlns:wp="http://schemas.openxmlformats.org/drawingml/2006/wordprocessingDrawing" xmlns:w10="urn:schemas-microsoft-com:office:word" xmlns:w="http://schemas.openxmlformats.org/wordprocessingml/2006/main" xmlns:w14="http://schemas.microsoft.com/office/word/2010/wordml" xmlns:w15="http://schemas.microsoft.com/office/word/2012/wordml" xmlns:w16cex="http://schemas.microsoft.com/office/word/2018/wordml/cex" xmlns:w16cid="http://schemas.microsoft.com/office/word/2016/wordml/cid" xmlns:w16="http://schemas.microsoft.com/office/word/2018/wordml" xmlns:w16du="http://schemas.microsoft.com/office/word/2023/wordml/word16du" xmlns:w16sdtdh="http://schemas.microsoft.com/office/word/2020/wordml/sdtdatahash" xmlns:w16sdtfl="http://schemas.microsoft.com/office/word/2024/wordml/sdtformatlock" xmlns:w16se="http://schemas.microsoft.com/office/word/2015/wordml/symex" xmlns:wpg="http://schemas.microsoft.com/office/word/2010/wordprocessingGroup" xmlns:wpi="http://schemas.microsoft.com/office/word/2010/wordprocessingInk" xmlns:wne="http://schemas.microsoft.com/office/word/2006/wordml" xmlns:wps="http://schemas.microsoft.com/office/word/2010/wordprocessingShape" mc:Ignorable="w14 w15 w16se w16cid w16 w16cex w16sdtdh w16sdtfl w16du wp14">
+<w:hdr xmlns:wpc="http://schemas.microsoft.com/office/word/2010/wordprocessingCanvas" xmlns:cx="http://schemas.microsoft.com/office/drawing/2014/chartex" xmlns:cx1="http://schemas.microsoft.com/office/drawing/2015/9/8/chartex" xmlns:cx2="http://schemas.microsoft.com/office/drawing/2015/10/21/chartex" xmlns:cx3="http://schemas.microsoft.com/office/drawing/2016/5/9/chartex" xmlns:cx4="http://schemas.microsoft.com/office/drawing/2016/5/10/chartex" xmlns:cx5="http://schemas.microsoft.com/office/drawing/2016/5/11/chartex" xmlns:cx6="http://schemas.microsoft.com/office/drawing/2016/5/12/chartex" xmlns:cx7="http://schemas.microsoft.com/office/drawing/2016/5/13/chartex" xmlns:cx8="http://schemas.microsoft.com/office/drawing/2016/5/14/chartex" xmlns:mc="http://schemas.openxmlformats.org/markup-compatibility/2006" xmlns:aink="http://schemas.microsoft.com/office/drawing/2016/ink" xmlns:am3d="http://schemas.microsoft.com/office/drawing/2017/model3d" xmlns:o="urn:schemas-microsoft-com:office:office" xmlns:oel="http://schemas.microsoft.com/office/2019/extlst" xmlns:r="http://schemas.openxmlformats.org/officeDocument/2006/relationships" xmlns:m="http://schemas.openxmlformats.org/officeDocument/2006/math" xmlns:v="urn:schemas-microsoft-com:vml" xmlns:wp14="http://schemas.microsoft.com/office/word/2010/wordprocessingDrawing" xmlns:wp="http://schemas.openxmlformats.org/drawingml/2006/wordprocessingDrawing" xmlns:w10="urn:schemas-microsoft-com:office:word" xmlns:w="http://schemas.openxmlformats.org/wordprocessingml/2006/main" xmlns:w14="http://schemas.microsoft.com/office/word/2010/wordml" xmlns:w15="http://schemas.microsoft.com/office/word/2012/wordml" xmlns:w16cei="http://schemas.microsoft.com/office/word/2026/wordml/cei" xmlns:w16cex="http://schemas.microsoft.com/office/word/2018/wordml/cex" xmlns:w16cid="http://schemas.microsoft.com/office/word/2016/wordml/cid" xmlns:w16="http://schemas.microsoft.com/office/word/2018/wordml" xmlns:w16du="http://schemas.microsoft.com/office/word/2023/wordml/word16du" xmlns:w16sdtdh="http://schemas.microsoft.com/office/word/2020/wordml/sdtdatahash" xmlns:w16sdtfl="http://schemas.microsoft.com/office/word/2024/wordml/sdtformatlock" xmlns:w16se="http://schemas.microsoft.com/office/word/2015/wordml/symex" xmlns:wpg="http://schemas.microsoft.com/office/word/2010/wordprocessingGroup" xmlns:wpi="http://schemas.microsoft.com/office/word/2010/wordprocessingInk" xmlns:wne="http://schemas.microsoft.com/office/word/2006/wordml" xmlns:wps="http://schemas.microsoft.com/office/word/2010/wordprocessingShape" mc:Ignorable="w14 w15 w16se w16cid w16 w16cex w16sdtdh w16sdtfl w16du wp14">
   <w:p>
     <w:pPr>
       <w:pStyle w:val="Header"/>
@@ -5420,7 +5980,7 @@
 </file>
 
 <file path=word/numbering.xml><?xml version="1.0" encoding="utf-8"?>
-<w:numbering xmlns:wpc="http://schemas.microsoft.com/office/word/2010/wordprocessingCanvas" xmlns:cx="http://schemas.microsoft.com/office/drawing/2014/chartex" xmlns:cx1="http://schemas.microsoft.com/office/drawing/2015/9/8/chartex" xmlns:cx2="http://schemas.microsoft.com/office/drawing/2015/10/21/chartex" xmlns:cx3="http://schemas.microsoft.com/office/drawing/2016/5/9/chartex" xmlns:cx4="http://schemas.microsoft.com/office/drawing/2016/5/10/chartex" xmlns:cx5="http://schemas.microsoft.com/office/drawing/2016/5/11/chartex" xmlns:cx6="http://schemas.microsoft.com/office/drawing/2016/5/12/chartex" xmlns:cx7="http://schemas.microsoft.com/office/drawing/2016/5/13/chartex" xmlns:cx8="http://schemas.microsoft.com/office/drawing/2016/5/14/chartex" xmlns:mc="http://schemas.openxmlformats.org/markup-compatibility/2006" xmlns:aink="http://schemas.microsoft.com/office/drawing/2016/ink" xmlns:am3d="http://schemas.microsoft.com/office/drawing/2017/model3d" xmlns:o="urn:schemas-microsoft-com:office:office" xmlns:oel="http://schemas.microsoft.com/office/2019/extlst" xmlns:r="http://schemas.openxmlformats.org/officeDocument/2006/relationships" xmlns:m="http://schemas.openxmlformats.org/officeDocument/2006/math" xmlns:v="urn:schemas-microsoft-com:vml" xmlns:wp14="http://schemas.microsoft.com/office/word/2010/wordprocessingDrawing" xmlns:wp="http://schemas.openxmlformats.org/drawingml/2006/wordprocessingDrawing" xmlns:w10="urn:schemas-microsoft-com:office:word" xmlns:w="http://schemas.openxmlformats.org/wordprocessingml/2006/main" xmlns:w14="http://schemas.microsoft.com/office/word/2010/wordml" xmlns:w15="http://schemas.microsoft.com/office/word/2012/wordml" xmlns:w16cex="http://schemas.microsoft.com/office/word/2018/wordml/cex" xmlns:w16cid="http://schemas.microsoft.com/office/word/2016/wordml/cid" xmlns:w16="http://schemas.microsoft.com/office/word/2018/wordml" xmlns:w16du="http://schemas.microsoft.com/office/word/2023/wordml/word16du" xmlns:w16sdtdh="http://schemas.microsoft.com/office/word/2020/wordml/sdtdatahash" xmlns:w16sdtfl="http://schemas.microsoft.com/office/word/2024/wordml/sdtformatlock" xmlns:w16se="http://schemas.microsoft.com/office/word/2015/wordml/symex" xmlns:wpg="http://schemas.microsoft.com/office/word/2010/wordprocessingGroup" xmlns:wpi="http://schemas.microsoft.com/office/word/2010/wordprocessingInk" xmlns:wne="http://schemas.microsoft.com/office/word/2006/wordml" xmlns:wps="http://schemas.microsoft.com/office/word/2010/wordprocessingShape" mc:Ignorable="w14 w15 w16se w16cid w16 w16cex w16sdtdh w16sdtfl w16du wp14">
+<w:numbering xmlns:wpc="http://schemas.microsoft.com/office/word/2010/wordprocessingCanvas" xmlns:cx="http://schemas.microsoft.com/office/drawing/2014/chartex" xmlns:cx1="http://schemas.microsoft.com/office/drawing/2015/9/8/chartex" xmlns:cx2="http://schemas.microsoft.com/office/drawing/2015/10/21/chartex" xmlns:cx3="http://schemas.microsoft.com/office/drawing/2016/5/9/chartex" xmlns:cx4="http://schemas.microsoft.com/office/drawing/2016/5/10/chartex" xmlns:cx5="http://schemas.microsoft.com/office/drawing/2016/5/11/chartex" xmlns:cx6="http://schemas.microsoft.com/office/drawing/2016/5/12/chartex" xmlns:cx7="http://schemas.microsoft.com/office/drawing/2016/5/13/chartex" xmlns:cx8="http://schemas.microsoft.com/office/drawing/2016/5/14/chartex" xmlns:mc="http://schemas.openxmlformats.org/markup-compatibility/2006" xmlns:aink="http://schemas.microsoft.com/office/drawing/2016/ink" xmlns:am3d="http://schemas.microsoft.com/office/drawing/2017/model3d" xmlns:o="urn:schemas-microsoft-com:office:office" xmlns:oel="http://schemas.microsoft.com/office/2019/extlst" xmlns:r="http://schemas.openxmlformats.org/officeDocument/2006/relationships" xmlns:m="http://schemas.openxmlformats.org/officeDocument/2006/math" xmlns:v="urn:schemas-microsoft-com:vml" xmlns:wp14="http://schemas.microsoft.com/office/word/2010/wordprocessingDrawing" xmlns:wp="http://schemas.openxmlformats.org/drawingml/2006/wordprocessingDrawing" xmlns:w10="urn:schemas-microsoft-com:office:word" xmlns:w="http://schemas.openxmlformats.org/wordprocessingml/2006/main" xmlns:w14="http://schemas.microsoft.com/office/word/2010/wordml" xmlns:w15="http://schemas.microsoft.com/office/word/2012/wordml" xmlns:w16cei="http://schemas.microsoft.com/office/word/2026/wordml/cei" xmlns:w16cex="http://schemas.microsoft.com/office/word/2018/wordml/cex" xmlns:w16cid="http://schemas.microsoft.com/office/word/2016/wordml/cid" xmlns:w16="http://schemas.microsoft.com/office/word/2018/wordml" xmlns:w16du="http://schemas.microsoft.com/office/word/2023/wordml/word16du" xmlns:w16sdtdh="http://schemas.microsoft.com/office/word/2020/wordml/sdtdatahash" xmlns:w16sdtfl="http://schemas.microsoft.com/office/word/2024/wordml/sdtformatlock" xmlns:w16se="http://schemas.microsoft.com/office/word/2015/wordml/symex" xmlns:wpg="http://schemas.microsoft.com/office/word/2010/wordprocessingGroup" xmlns:wpi="http://schemas.microsoft.com/office/word/2010/wordprocessingInk" xmlns:wne="http://schemas.microsoft.com/office/word/2006/wordml" xmlns:wps="http://schemas.microsoft.com/office/word/2010/wordprocessingShape" mc:Ignorable="w14 w15 w16se w16cid w16 w16cex w16sdtdh w16sdtfl w16du wp14">
   <w:abstractNum w:abstractNumId="0" w15:restartNumberingAfterBreak="0">
     <w:nsid w:val="FFFFFF7C"/>
     <w:multiLevelType w:val="singleLevel"/>

</xml_diff>